<commit_message>
newlook: top5 category dropdown with "Alle categorieën" default
Feedback item 9: replace the ~30-pill category selector with a styled
native dropdown (works as a native picker on mobile — also covers mobile
item 7). Add an "Alle categorieën" option, now the default, which stacks
every category's Top 5 down the page; picking a category narrows to it.
Logo tiles left bg-cream (already on-palette, not white); missing logos
deferred. Annotate items 8, 9 and mobile 7 as DONE in website_feedback.docx.

Co-Authored-By: Claude Opus 4.8 (1M context) <noreply@anthropic.com>
</commit_message>
<xml_diff>
--- a/website_feedback.docx
+++ b/website_feedback.docx
@@ -787,6 +787,26 @@
       </w:r>
     </w:p>
     <w:p>
+      <w:r>
+        <w:rPr>
+          <w:b/>
+          <w:color w:val="1B7F37"/>
+          <w:sz w:val="20"/>
+        </w:rPr>
+        <w:t xml:space="preserve">➤ CLAUDE → DONE: BF deal cards — 'Bekijk deal' is now a sky pill button like the homepage CTA, and the category chip ('beauty' etc.) went from ink/55 to full-ink + semibold so it no longer fades. Shared #dealCard template (all categories + search). (2026-07-06)</w:t>
+      </w:r>
+    </w:p>
+    <w:p>
+      <w:r>
+        <w:rPr>
+          <w:b/>
+          <w:color w:val="1B7F37"/>
+          <w:sz w:val="20"/>
+        </w:rPr>
+        <w:t xml:space="preserve">➤ CLAUDE → DONE: Top5 categorie-selector is now a dropdown (replaced the ~30 pills) with an 'Alle categorieën' default that stacks every category's Top 5; picking one narrows to that category. Logo tiles already bg-cream (pale yellow, not pure white) — left as-is. Missing logos: SKIP (kan later). (2026-07-06)</w:t>
+      </w:r>
+    </w:p>
+    <w:p>
       <w:pPr>
         <w:ind w:left="0" w:firstLine="0"/>
         <w:rPr/>
@@ -2123,6 +2143,16 @@
         <w:rPr>
           <w:rtl w:val="0"/>
         </w:rPr>
+      </w:r>
+    </w:p>
+    <w:p>
+      <w:r>
+        <w:rPr>
+          <w:b/>
+          <w:color w:val="1B7F37"/>
+          <w:sz w:val="20"/>
+        </w:rPr>
+        <w:t xml:space="preserve">➤ CLAUDE → DONE: Categorie-selector is nu een dropdown (native select, ook mobiel) en de 'Alle categorieën' default toont de top 5's direct in beeld. (2026-07-06)</w:t>
       </w:r>
     </w:p>
     <w:p>

</xml_diff>

<commit_message>
newlook: update TikTok handle to @andyyrobe + nudge contact "?"
Feedback item 11: switch the TikTok handle @wiegeeftkorting2 -> @andyyrobe
everywhere it appears (contact page title-handle + href, footer link,
homepage + v2 JSON-LD sameAs, v1 brand-page social banner) so the visible
links and structured data stay consistent. Nudge the "?" in the contact
"samenwerking?" heading slightly right (ml-1), kept blue. Annotate item 11
DONE in website_feedback.docx.

Co-Authored-By: Claude Opus 4.8 (1M context) <noreply@anthropic.com>
</commit_message>
<xml_diff>
--- a/website_feedback.docx
+++ b/website_feedback.docx
@@ -1234,6 +1234,16 @@
         <w:rPr>
           <w:rtl w:val="0"/>
         </w:rPr>
+      </w:r>
+    </w:p>
+    <w:p>
+      <w:r>
+        <w:rPr>
+          <w:b/>
+          <w:color w:val="1B7F37"/>
+          <w:sz w:val="20"/>
+        </w:rPr>
+        <w:t xml:space="preserve">➤ CLAUDE → DONE: TikTok handle @wiegeeftkorting2 → @andyyrobe sitewide (contact page title-handle + href, footer link, homepage + v2 JSON-LD sameAs, v1 brand-page banner). The '?' in 'samenwerking?' nudged right (ml-1), kept blue. (2026-07-06)</w:t>
       </w:r>
     </w:p>
     <w:p>

</xml_diff>

<commit_message>
newlook: remove broken in-article jump links from blog posts
Feedback item 12: the "In dit artikel" TOC anchor links didn't work — bare
#anchor hrefs resolve against <base href="/"> and jump to the homepage
instead of scrolling in-page. Removed the TOC nav from the Uniqlo and
Lookfantastic posts (Space-NK had none). Section id anchors left in place.
Annotate item 12 DONE in website_feedback.docx.

Co-Authored-By: Claude Opus 4.8 (1M context) <noreply@anthropic.com>
</commit_message>
<xml_diff>
--- a/website_feedback.docx
+++ b/website_feedback.docx
@@ -1244,6 +1244,16 @@
           <w:sz w:val="20"/>
         </w:rPr>
         <w:t xml:space="preserve">➤ CLAUDE → DONE: TikTok handle @wiegeeftkorting2 → @andyyrobe sitewide (contact page title-handle + href, footer link, homepage + v2 JSON-LD sameAs, v1 brand-page banner). The '?' in 'samenwerking?' nudged right (ml-1), kept blue. (2026-07-06)</w:t>
+      </w:r>
+    </w:p>
+    <w:p>
+      <w:r>
+        <w:rPr>
+          <w:b/>
+          <w:color w:val="1B7F37"/>
+          <w:sz w:val="20"/>
+        </w:rPr>
+        <w:t xml:space="preserve">➤ CLAUDE → DONE: Removed the broken 'In dit artikel' jump-link nav from the Uniqlo and Lookfantastic blog posts (bare #anchor hrefs resolved to the homepage under base href, so they didn't work). Space-NK had no TOC. Section id anchors left in place. (2026-07-06)</w:t>
       </w:r>
     </w:p>
     <w:p>

</xml_diff>

<commit_message>
newlook: remove "Plaats code" button from the navbar
Feedback item 14: the "Plaats code" pill was too in-your-face on the main
bar. Removed it from the desktop and mobile menus (and the now-orphaned
divider). Placing a code still lives on the Prikbord page via its own
"+ Deel een code" CTA. Annotate item 14 DONE in website_feedback.docx.

Co-Authored-By: Claude Opus 4.8 (1M context) <noreply@anthropic.com>
</commit_message>
<xml_diff>
--- a/website_feedback.docx
+++ b/website_feedback.docx
@@ -1545,6 +1545,16 @@
             </a:graphic>
           </wp:anchor>
         </w:drawing>
+      </w:r>
+    </w:p>
+    <w:p>
+      <w:r>
+        <w:rPr>
+          <w:b/>
+          <w:color w:val="1B7F37"/>
+          <w:sz w:val="20"/>
+        </w:rPr>
+        <w:t xml:space="preserve">➤ CLAUDE → DONE: Removed the 'Plaats code' pill button from the navbar (desktop + mobile menu, plus the orphaned divider). Placing a code still lives on the Prikbord page via its own '+ Deel een code' CTA. (2026-07-06)</w:t>
       </w:r>
     </w:p>
     <w:p>

</xml_diff>

<commit_message>
newlook: simplify search placeholder + rank matched shop to top
Mobile feedback M1 + M2 (homepage search):
- M1: placeholder -> "Zoek op webshop..." (was "Zoek een shop — NA-KD,
  Temu, Gymshark…"), same on mobile + desktop; drops the em-dash and the
  Gymshark that was clipped on narrow phones.
- M2: rank search results exact-match first, then prefix, then the rest
  (stable within each rank) so a typed shop like Hunkemöller lands at the
  top instead of buried in feed order.
Annotate M1 + M2 DONE in website_feedback.docx.

Co-Authored-By: Claude Opus 4.8 (1M context) <noreply@anthropic.com>
</commit_message>
<xml_diff>
--- a/website_feedback.docx
+++ b/website_feedback.docx
@@ -2002,6 +2002,16 @@
       </w:r>
     </w:p>
     <w:p>
+      <w:r>
+        <w:rPr>
+          <w:b/>
+          <w:color w:val="1B7F37"/>
+          <w:sz w:val="20"/>
+        </w:rPr>
+        <w:t xml:space="preserve">➤ CLAUDE → DONE: Homepage search placeholder simplified to 'Zoek op webshop...' (was 'Zoek een shop — NA-KD, Temu, Gymshark…'), same on mobile + desktop — drops the em-dash and the clipped 'Gymshark'. (2026-07-06)</w:t>
+      </w:r>
+    </w:p>
+    <w:p>
       <w:pPr>
         <w:numPr>
           <w:ilvl w:val="0"/>
@@ -2019,6 +2029,16 @@
         <w:br w:type="textWrapping"/>
         <w:t xml:space="preserve">&gt;haal ook het streepje weg en doe ‘:’ </w:t>
         <w:br w:type="textWrapping"/>
+      </w:r>
+    </w:p>
+    <w:p>
+      <w:r>
+        <w:rPr>
+          <w:b/>
+          <w:color w:val="1B7F37"/>
+          <w:sz w:val="20"/>
+        </w:rPr>
+        <w:t xml:space="preserve">➤ CLAUDE → DONE: Search results now rank exact matches first, then prefix matches, then the rest (stable within each rank), so a typed shop like Hunkemöller surfaces at the top instead of buried in feed order. (2026-07-06)</w:t>
       </w:r>
     </w:p>
     <w:p>

</xml_diff>

<commit_message>
newlook: blog cards use article photos + equal sizing + date fix
Feedback item 10: replace the emoji previews with a product photo reused
from each article — uniqlo (airism-1) and lookfantastic (olaplex) use
existing local assets; space-nk's BYOMA shot was downloaded locally to
public/blog/space-nk/ (resized to 700px / 29KB). Emoji kept as fallback.

Per follow-up: drop the oversized 2-column "featured" layout so all blogs
render as equal grid cards (desktop + mobile), and remove the now-unused
featured/rest getters. Fix the uniqlo date Juni 2025 -> Juni 2026 across
the listing and article (incl. the "mei"/"zomer" mentions); left the
external source link URL untouched so it doesn't break.

Annotate item 10 DONE in website_feedback.docx.

Co-Authored-By: Claude Opus 4.8 (1M context) <noreply@anthropic.com>
</commit_message>
<xml_diff>
--- a/website_feedback.docx
+++ b/website_feedback.docx
@@ -969,6 +969,16 @@
         <w:rPr>
           <w:rtl w:val="0"/>
         </w:rPr>
+      </w:r>
+    </w:p>
+    <w:p>
+      <w:r>
+        <w:rPr>
+          <w:b/>
+          <w:color w:val="1B7F37"/>
+          <w:sz w:val="20"/>
+        </w:rPr>
+        <w:t xml:space="preserve">➤ CLAUDE → DONE: Blog cards now show a product photo reused from each article instead of the emoji (uniqlo airism-1, lookfantastic olaplex — local; space-nk BYOMA downloaded locally to public/blog/space-nk/, resized to 700px/29KB). Emoji kept as fallback. Also dropped the oversized 2-col 'featured' layout so all blogs are equal grid cards (per follow-up), and fixed the uniqlo date Juni 2025 -&gt; Juni 2026 across the listing + article (source 'mei' dates too; external link URL left intact). (2026-07-06)</w:t>
       </w:r>
     </w:p>
     <w:p>

</xml_diff>

<commit_message>
newlook: v2 brand page — codes above the fold on mobile
Mobile feedback M3: on a discount-code site the visitor must see actual
codes immediately. Compact the v2 brand-page hero on mobile (<=640px):
logo 64->48px, tighter padding/margins, smaller H1/H2 + section spacing,
hide the hero trust row (each coupon already shows "Getest / Gespot op"),
and point the skip-link at #codes. Clamp the hero lede to 2 lines with a
"Meer/Minder" toggle, shown only when it actually overflows (measured
client-side via ViewChild, re-measured on resize, reset on shop nav). The
full lede stays in the server-rendered HTML (verified), so no SEO impact.
Desktop unchanged. v1 fallback pages still to do.

Annotate M3 DONE in website_feedback.docx.

Co-Authored-By: Claude Opus 4.8 (1M context) <noreply@anthropic.com>
</commit_message>
<xml_diff>
--- a/website_feedback.docx
+++ b/website_feedback.docx
@@ -2067,6 +2067,16 @@
         <w:br w:type="textWrapping"/>
         <w:t xml:space="preserve">&gt;hunkemoller bovenaan als dat match met zoekfunctie</w:t>
         <w:br w:type="textWrapping"/>
+      </w:r>
+    </w:p>
+    <w:p>
+      <w:r>
+        <w:rPr>
+          <w:b/>
+          <w:color w:val="1B7F37"/>
+          <w:sz w:val="20"/>
+        </w:rPr>
+        <w:t xml:space="preserve">➤ CLAUDE → DONE (v2 brand pages): Mobile hero compacted so codes sit above the fold — logo 64→48px, tighter padding/margins, smaller H1/H2 + section spacing, hero trust row hidden on mobile (each coupon already shows '✓ Getest · Gespot op'), and the skip-link now targets #codes. Hero lede clamps to 2 lines with a 'Meer/Minder' toggle (only when it overflows; measured client-side, re-measured on resize). Full lede stays in the SSR HTML → no SEO impact. Desktop unchanged. v1 fallback pages still to do. (2026-07-06)</w:t>
       </w:r>
     </w:p>
     <w:p>

</xml_diff>

<commit_message>
newlook: mobile navbar non-sticky so open menu scrolls away
Mobile feedback M4: match the live claude_seo_improvements behaviour where
an opened mobile menu stays open but scrolls out of the viewport with the
header on scroll-down. The new-look nav was tw-sticky top-0, which pinned
the bar + open menu on screen. Make it lg:sticky only — static on mobile
(scrolls away naturally), still sticky on desktop (no hamburger there).
Annotate M4 DONE in website_feedback.docx.

Co-Authored-By: Claude Opus 4.8 (1M context) <noreply@anthropic.com>
</commit_message>
<xml_diff>
--- a/website_feedback.docx
+++ b/website_feedback.docx
@@ -2135,6 +2135,16 @@
           <w:rtl w:val="0"/>
         </w:rPr>
         <w:t xml:space="preserve">Image 4: menu</w:t>
+      </w:r>
+    </w:p>
+    <w:p>
+      <w:r>
+        <w:rPr>
+          <w:b/>
+          <w:color w:val="1B7F37"/>
+          <w:sz w:val="20"/>
+        </w:rPr>
+        <w:t xml:space="preserve">➤ CLAUDE → DONE: Mobile menu now matches the live claude_seo_improvements behaviour — the navbar is non-sticky on mobile (lg:sticky only), so an opened menu stays open but scrolls out of the viewport with the header when you scroll down. Desktop nav stays sticky (no hamburger there). (2026-07-06)</w:t>
       </w:r>
     </w:p>
     <w:p>

</xml_diff>

<commit_message>
docs: mark desktop items 13 + 15 as SKIP
Per decision: park the brand-page offers-vs-codes filter (item 13, needs a
data definition — the feed has no offer/code distinction) and the
email-gate flow removal (item 15, product decision). Annotate both SKIP in
website_feedback.docx.

Co-Authored-By: Claude Opus 4.8 (1M context) <noreply@anthropic.com>
</commit_message>
<xml_diff>
--- a/website_feedback.docx
+++ b/website_feedback.docx
@@ -1565,6 +1565,26 @@
           <w:sz w:val="20"/>
         </w:rPr>
         <w:t xml:space="preserve">➤ CLAUDE → DONE: Removed the 'Plaats code' pill button from the navbar (desktop + mobile menu, plus the orphaned divider). Placing a code still lives on the Prikbord page via its own '+ Deel een code' CTA. (2026-07-06)</w:t>
+      </w:r>
+    </w:p>
+    <w:p>
+      <w:r>
+        <w:rPr>
+          <w:b/>
+          <w:color w:val="B00020"/>
+          <w:sz w:val="20"/>
+        </w:rPr>
+        <w:t xml:space="preserve">➤ CLAUDE → SKIP: Offers-vs-codes filter parked for now — the discount feed has no aanbieding/kortingscode distinction to filter on (every entry is a code), so it needs a data definition first. (2026-07-06)</w:t>
+      </w:r>
+    </w:p>
+    <w:p>
+      <w:r>
+        <w:rPr>
+          <w:b/>
+          <w:color w:val="B00020"/>
+          <w:sz w:val="20"/>
+        </w:rPr>
+        <w:t xml:space="preserve">➤ CLAUDE → SKIP: Removing the email-gate/unlock flow parked for now — it's a product decision (loses the only place the coupon code is shown, and the Klaviyo/Brevo email-capture funnel). (2026-07-06)</w:t>
       </w:r>
     </w:p>
     <w:p>

</xml_diff>